<commit_message>
Implementing Face Login when not found known mac address to login with
</commit_message>
<xml_diff>
--- a/Docs/Phase IV Grading Criteria.docx
+++ b/Docs/Phase IV Grading Criteria.docx
@@ -999,6 +999,73 @@
             </w:pPr>
             <w:r>
               <w:t>Youssef Ehab</w:t>
+            </w:r>
+          </w:p>
+        </w:tc>
+        <w:tc>
+          <w:tcPr>
+            <w:tcW w:w="2917" w:type="dxa"/>
+            <w:vAlign w:val="center"/>
+          </w:tcPr>
+          <w:p>
+            <w:pPr>
+              <w:jc w:val="center"/>
+              <w:cnfStyle w:val="000000000000" w:firstRow="0" w:lastRow="0" w:firstColumn="0" w:lastColumn="0" w:oddVBand="0" w:evenVBand="0" w:oddHBand="0" w:evenHBand="0" w:firstRowFirstColumn="0" w:firstRowLastColumn="0" w:lastRowFirstColumn="0" w:lastRowLastColumn="0"/>
+              <w:rPr>
+                <w:rFonts w:asciiTheme="majorBidi" w:hAnsiTheme="majorBidi" w:cstheme="majorBidi"/>
+                <w:lang w:val="en-US"/>
+              </w:rPr>
+            </w:pPr>
+          </w:p>
+        </w:tc>
+        <w:tc>
+          <w:tcPr>
+            <w:tcW w:w="815" w:type="dxa"/>
+            <w:vAlign w:val="center"/>
+          </w:tcPr>
+          <w:p>
+            <w:pPr>
+              <w:jc w:val="center"/>
+              <w:cnfStyle w:val="000000000000" w:firstRow="0" w:lastRow="0" w:firstColumn="0" w:lastColumn="0" w:oddVBand="0" w:evenVBand="0" w:oddHBand="0" w:evenHBand="0" w:firstRowFirstColumn="0" w:firstRowLastColumn="0" w:lastRowFirstColumn="0" w:lastRowLastColumn="0"/>
+              <w:rPr>
+                <w:rFonts w:asciiTheme="majorBidi" w:hAnsiTheme="majorBidi" w:cstheme="majorBidi"/>
+                <w:lang w:val="en-US"/>
+              </w:rPr>
+            </w:pPr>
+          </w:p>
+        </w:tc>
+      </w:tr>
+      <w:tr>
+        <w:trPr>
+          <w:trHeight w:val="380"/>
+        </w:trPr>
+        <w:tc>
+          <w:tcPr>
+            <w:cnfStyle w:val="001000000000" w:firstRow="0" w:lastRow="0" w:firstColumn="1" w:lastColumn="0" w:oddVBand="0" w:evenVBand="0" w:oddHBand="0" w:evenHBand="0" w:firstRowFirstColumn="0" w:firstRowLastColumn="0" w:lastRowFirstColumn="0" w:lastRowLastColumn="0"/>
+            <w:tcW w:w="2206" w:type="dxa"/>
+            <w:vAlign w:val="center"/>
+          </w:tcPr>
+          <w:p>
+            <w:pPr>
+              <w:jc w:val="center"/>
+            </w:pPr>
+            <w:r>
+              <w:t>233753</w:t>
+            </w:r>
+          </w:p>
+        </w:tc>
+        <w:tc>
+          <w:tcPr>
+            <w:tcW w:w="4241" w:type="dxa"/>
+            <w:vAlign w:val="center"/>
+          </w:tcPr>
+          <w:p>
+            <w:pPr>
+              <w:jc w:val="center"/>
+              <w:cnfStyle w:val="000000000000" w:firstRow="0" w:lastRow="0" w:firstColumn="0" w:lastColumn="0" w:oddVBand="0" w:evenVBand="0" w:oddHBand="0" w:evenHBand="0" w:firstRowFirstColumn="0" w:firstRowLastColumn="0" w:lastRowFirstColumn="0" w:lastRowLastColumn="0"/>
+            </w:pPr>
+            <w:r>
+              <w:t>Ayad Ahmed</w:t>
             </w:r>
           </w:p>
         </w:tc>

</xml_diff>